<commit_message>
Update names in report, forecast template, and app
</commit_message>
<xml_diff>
--- a/TECHNICAL_REPORT.docx
+++ b/TECHNICAL_REPORT.docx
@@ -1371,7 +1371,7 @@
           <w:i w:val="0"/>
           <w:sz w:val="22"/>
         </w:rPr>
-        <w:t>The cleaning pipeline in cleaning.py performs 8 sequential steps:</w:t>
+        <w:t>The cleaning pipeline in cleaning.py performs 8 sequential steps. Each step is described below with its rationale.</w:t>
       </w:r>
     </w:p>
     <w:tbl>
@@ -1864,6 +1864,181 @@
         </w:tc>
       </w:tr>
     </w:tbl>
+    <w:p/>
+    <w:p>
+      <w:pPr>
+        <w:pStyle w:val="Heading3"/>
+        <w:jc w:val="left"/>
+      </w:pPr>
+      <w:r>
+        <w:rPr>
+          <w:rFonts w:ascii="Calibri" w:hAnsi="Calibri"/>
+          <w:color w:val="1F2937"/>
+          <w:sz w:val="22"/>
+        </w:rPr>
+        <w:t>3.3.1 Step-by-Step Justification</w:t>
+      </w:r>
+    </w:p>
+    <w:p>
+      <w:r>
+        <w:rPr>
+          <w:rFonts w:ascii="Calibri" w:hAnsi="Calibri"/>
+          <w:b/>
+          <w:i w:val="0"/>
+          <w:sz w:val="22"/>
+        </w:rPr>
+        <w:t xml:space="preserve">Step 1 — Filter Valid Orders: </w:t>
+      </w:r>
+      <w:r>
+        <w:rPr>
+          <w:rFonts w:ascii="Calibri" w:hAnsi="Calibri"/>
+          <w:b w:val="0"/>
+          <w:i w:val="0"/>
+          <w:sz w:val="22"/>
+        </w:rPr>
+        <w:t>Keeps only rows where the order status is "received" or "complete". Cancelled, refunded, and processing orders are excluded because they do not represent real fulfilled demand. Including them would cause the forecasting model to overestimate true customer demand, leading to inflated reorder recommendations.</w:t>
+      </w:r>
+    </w:p>
+    <w:p>
+      <w:r>
+        <w:rPr>
+          <w:rFonts w:ascii="Calibri" w:hAnsi="Calibri"/>
+          <w:b/>
+          <w:i w:val="0"/>
+          <w:sz w:val="22"/>
+        </w:rPr>
+        <w:t xml:space="preserve">Step 2 — Drop Irrelevant Columns: </w:t>
+      </w:r>
+      <w:r>
+        <w:rPr>
+          <w:rFonts w:ascii="Calibri" w:hAnsi="Calibri"/>
+          <w:b w:val="0"/>
+          <w:i w:val="0"/>
+          <w:sz w:val="22"/>
+        </w:rPr>
+        <w:t>Removes 18 columns including personal information (First Name, Last Name, SSN, E Mail, Phone No.) and location/discount fields (City, State, Zip, Discount_Percent). This serves two purposes: (a) data privacy — SSN, email, and phone numbers are personally identifiable information (PII) that should not be retained in an analytics dataset; and (b) noise reduction — the forecasting model only requires order_date, category, qty_ordered, price, and sku. Extra columns slow processing without contributing analytical value.</w:t>
+      </w:r>
+    </w:p>
+    <w:p>
+      <w:r>
+        <w:rPr>
+          <w:rFonts w:ascii="Calibri" w:hAnsi="Calibri"/>
+          <w:b/>
+          <w:i w:val="0"/>
+          <w:sz w:val="22"/>
+        </w:rPr>
+        <w:t xml:space="preserve">Step 3 — Remove Missing Values: </w:t>
+      </w:r>
+      <w:r>
+        <w:rPr>
+          <w:rFonts w:ascii="Calibri" w:hAnsi="Calibri"/>
+          <w:b w:val="0"/>
+          <w:i w:val="0"/>
+          <w:sz w:val="22"/>
+        </w:rPr>
+        <w:t>Drops any row missing qty_ordered, price, order_date, or category. These four fields are essential: without a date, the row cannot be placed in the time series; without quantity or price, demand and revenue cannot be computed; without category, the row cannot be grouped. Incomplete rows would cause NaN propagation errors in downstream aggregation and forecasting.</w:t>
+      </w:r>
+    </w:p>
+    <w:p>
+      <w:r>
+        <w:rPr>
+          <w:rFonts w:ascii="Calibri" w:hAnsi="Calibri"/>
+          <w:b/>
+          <w:i w:val="0"/>
+          <w:sz w:val="22"/>
+        </w:rPr>
+        <w:t xml:space="preserve">Step 4 — Remove Invalid Numbers: </w:t>
+      </w:r>
+      <w:r>
+        <w:rPr>
+          <w:rFonts w:ascii="Calibri" w:hAnsi="Calibri"/>
+          <w:b w:val="0"/>
+          <w:i w:val="0"/>
+          <w:sz w:val="22"/>
+        </w:rPr>
+        <w:t>Removes rows where qty_ordered ≤ 0 or price ≤ 0. Zero or negative quantities likely represent data entry errors or product returns. Negative prices are nonsensical. Including these values would distort average demand calculations and make the reorder point formula produce unreliable recommendations.</w:t>
+      </w:r>
+    </w:p>
+    <w:p>
+      <w:r>
+        <w:rPr>
+          <w:rFonts w:ascii="Calibri" w:hAnsi="Calibri"/>
+          <w:b/>
+          <w:i w:val="0"/>
+          <w:sz w:val="22"/>
+        </w:rPr>
+        <w:t xml:space="preserve">Step 5 — Convert Date: </w:t>
+      </w:r>
+      <w:r>
+        <w:rPr>
+          <w:rFonts w:ascii="Calibri" w:hAnsi="Calibri"/>
+          <w:b w:val="0"/>
+          <w:i w:val="0"/>
+          <w:sz w:val="22"/>
+        </w:rPr>
+        <w:t>Converts the order_date column from raw strings to Python datetime objects. This conversion is required for all time-based operations in the system: monthly and weekly resampling, Prophet time-series forecasting, and date-range filtering on the dashboard. Without this step, pandas treats dates as plain text and cannot perform chronological sorting or temporal aggregation.</w:t>
+      </w:r>
+    </w:p>
+    <w:p>
+      <w:r>
+        <w:rPr>
+          <w:rFonts w:ascii="Calibri" w:hAnsi="Calibri"/>
+          <w:b/>
+          <w:i w:val="0"/>
+          <w:sz w:val="22"/>
+        </w:rPr>
+        <w:t xml:space="preserve">Step 6 — Category-Day Aggregation: </w:t>
+      </w:r>
+      <w:r>
+        <w:rPr>
+          <w:rFonts w:ascii="Calibri" w:hAnsi="Calibri"/>
+          <w:b w:val="0"/>
+          <w:i w:val="0"/>
+          <w:sz w:val="22"/>
+        </w:rPr>
+        <w:t>Groups all individual order-line records by (category, order_date) and computes: total qty_ordered (sum), average unit price (mean), and count of distinct SKUs (nunique). The raw data contains one row per order line item (~286,000 rows), but the DSS forecasts at the category-day level, not the individual order level. This aggregation creates the time series that Prophet requires — one data point per category per day. This is the step that reduces 286,392 rows to approximately 4,683 rows.</w:t>
+      </w:r>
+    </w:p>
+    <w:p>
+      <w:r>
+        <w:rPr>
+          <w:rFonts w:ascii="Calibri" w:hAnsi="Calibri"/>
+          <w:b/>
+          <w:i w:val="0"/>
+          <w:sz w:val="22"/>
+        </w:rPr>
+        <w:t xml:space="preserve">Step 7 — Cap Outliers at 99th Percentile: </w:t>
+      </w:r>
+      <w:r>
+        <w:rPr>
+          <w:rFonts w:ascii="Calibri" w:hAnsi="Calibri"/>
+          <w:b w:val="0"/>
+          <w:i w:val="0"/>
+          <w:sz w:val="22"/>
+        </w:rPr>
+        <w:t>For each category, any daily quantity value above the 99th percentile is clamped down to that threshold. Extreme spikes — for example, a single day with 10× normal volume due to a bulk order or a data entry error — would distort Prophet's trend estimation and inflate safety stock calculations. Capping rather than deleting preserves the row in the time series while limiting its statistical impact.</w:t>
+      </w:r>
+    </w:p>
+    <w:p>
+      <w:r>
+        <w:rPr>
+          <w:rFonts w:ascii="Calibri" w:hAnsi="Calibri"/>
+          <w:b/>
+          <w:i w:val="0"/>
+          <w:sz w:val="22"/>
+        </w:rPr>
+        <w:t xml:space="preserve">Step 8 — Remove Rare Categories: </w:t>
+      </w:r>
+      <w:r>
+        <w:rPr>
+          <w:rFonts w:ascii="Calibri" w:hAnsi="Calibri"/>
+          <w:b w:val="0"/>
+          <w:i w:val="0"/>
+          <w:sz w:val="22"/>
+        </w:rPr>
+        <w:t>Drops any category that appears on fewer than 5 distinct sales days. Prophet requires a minimum number of data points to detect weekly seasonality patterns. A category with only 2–3 days of history cannot support meaningful forecasting — the model would either overfit or fail entirely. This step retains only the 15 categories with sufficient data density for reliable time-series modeling.</w:t>
+      </w:r>
+    </w:p>
     <w:p/>
     <w:p>
       <w:pPr>
@@ -5958,6 +6133,21 @@
         <w:t>6.6 Automated Test Results</w:t>
       </w:r>
     </w:p>
+    <w:p>
+      <w:pPr>
+        <w:spacing w:after="120"/>
+        <w:jc w:val="both"/>
+      </w:pPr>
+      <w:r>
+        <w:rPr>
+          <w:rFonts w:ascii="Calibri" w:hAnsi="Calibri"/>
+          <w:b w:val="0"/>
+          <w:i w:val="0"/>
+          <w:sz w:val="22"/>
+        </w:rPr>
+        <w:t>The test suite in tests/test_app.py contains 7 automated tests that validate the core decision logic, data pipeline, and edge case handling. All tests use a small synthetic dataset (fixture) rather than the full 286K-row CSV, ensuring tests are fast and reproducible without external file dependencies.</w:t>
+      </w:r>
+    </w:p>
     <w:tbl>
       <w:tblPr>
         <w:tblStyle w:val="TableGrid"/>
@@ -5973,7 +6163,7 @@
       <w:tr>
         <w:tc>
           <w:tcPr>
-            <w:tcW w:type="dxa" w:w="3456"/>
+            <w:tcW w:type="dxa" w:w="432"/>
             <w:shd w:val="clear" w:color="auto" w:fill="1A56DB"/>
           </w:tcPr>
           <w:p>
@@ -5988,13 +6178,13 @@
                 <w:color w:val="FFFFFF"/>
                 <w:sz w:val="20"/>
               </w:rPr>
-              <w:t>Test</w:t>
+              <w:t>#</w:t>
             </w:r>
           </w:p>
         </w:tc>
         <w:tc>
           <w:tcPr>
-            <w:tcW w:type="dxa" w:w="3744"/>
+            <w:tcW w:type="dxa" w:w="5472"/>
             <w:shd w:val="clear" w:color="auto" w:fill="1A56DB"/>
           </w:tcPr>
           <w:p>
@@ -6009,7 +6199,7 @@
                 <w:color w:val="FFFFFF"/>
                 <w:sz w:val="20"/>
               </w:rPr>
-              <w:t>Description</w:t>
+              <w:t>Test Name</w:t>
             </w:r>
           </w:p>
         </w:tc>
@@ -6038,7 +6228,24 @@
       <w:tr>
         <w:tc>
           <w:tcPr>
-            <w:tcW w:type="dxa" w:w="3456"/>
+            <w:tcW w:type="dxa" w:w="432"/>
+            <w:shd w:val="clear" w:color="auto" w:fill="EFF6FF"/>
+          </w:tcPr>
+          <w:p>
+            <w:r>
+              <w:rPr>
+                <w:rFonts w:ascii="Calibri" w:hAnsi="Calibri"/>
+                <w:b w:val="0"/>
+                <w:i w:val="0"/>
+                <w:sz w:val="20"/>
+              </w:rPr>
+              <w:t>1</w:t>
+            </w:r>
+          </w:p>
+        </w:tc>
+        <w:tc>
+          <w:tcPr>
+            <w:tcW w:type="dxa" w:w="5472"/>
             <w:shd w:val="clear" w:color="auto" w:fill="EFF6FF"/>
           </w:tcPr>
           <w:p>
@@ -6050,23 +6257,6 @@
                 <w:sz w:val="20"/>
               </w:rPr>
               <w:t>test_compute_daily_metrics_uses_category</w:t>
-            </w:r>
-          </w:p>
-        </w:tc>
-        <w:tc>
-          <w:tcPr>
-            <w:tcW w:type="dxa" w:w="3744"/>
-            <w:shd w:val="clear" w:color="auto" w:fill="EFF6FF"/>
-          </w:tcPr>
-          <w:p>
-            <w:r>
-              <w:rPr>
-                <w:rFonts w:ascii="Calibri" w:hAnsi="Calibri"/>
-                <w:b w:val="0"/>
-                <w:i w:val="0"/>
-                <w:sz w:val="20"/>
-              </w:rPr>
-              <w:t>Verifies metrics function returns category-level breakdown</w:t>
             </w:r>
           </w:p>
         </w:tc>
@@ -6091,7 +6281,23 @@
       <w:tr>
         <w:tc>
           <w:tcPr>
-            <w:tcW w:type="dxa" w:w="3456"/>
+            <w:tcW w:type="dxa" w:w="432"/>
+          </w:tcPr>
+          <w:p>
+            <w:r>
+              <w:rPr>
+                <w:rFonts w:ascii="Calibri" w:hAnsi="Calibri"/>
+                <w:b w:val="0"/>
+                <w:i w:val="0"/>
+                <w:sz w:val="20"/>
+              </w:rPr>
+              <w:t>2</w:t>
+            </w:r>
+          </w:p>
+        </w:tc>
+        <w:tc>
+          <w:tcPr>
+            <w:tcW w:type="dxa" w:w="5472"/>
           </w:tcPr>
           <w:p>
             <w:r>
@@ -6102,22 +6308,6 @@
                 <w:sz w:val="20"/>
               </w:rPr>
               <w:t>test_build_dss_recommendations</w:t>
-            </w:r>
-          </w:p>
-        </w:tc>
-        <w:tc>
-          <w:tcPr>
-            <w:tcW w:type="dxa" w:w="3744"/>
-          </w:tcPr>
-          <w:p>
-            <w:r>
-              <w:rPr>
-                <w:rFonts w:ascii="Calibri" w:hAnsi="Calibri"/>
-                <w:b w:val="0"/>
-                <w:i w:val="0"/>
-                <w:sz w:val="20"/>
-              </w:rPr>
-              <w:t>Verifies reorder recommendations computed correctly</w:t>
             </w:r>
           </w:p>
         </w:tc>
@@ -6141,7 +6331,24 @@
       <w:tr>
         <w:tc>
           <w:tcPr>
-            <w:tcW w:type="dxa" w:w="3456"/>
+            <w:tcW w:type="dxa" w:w="432"/>
+            <w:shd w:val="clear" w:color="auto" w:fill="EFF6FF"/>
+          </w:tcPr>
+          <w:p>
+            <w:r>
+              <w:rPr>
+                <w:rFonts w:ascii="Calibri" w:hAnsi="Calibri"/>
+                <w:b w:val="0"/>
+                <w:i w:val="0"/>
+                <w:sz w:val="20"/>
+              </w:rPr>
+              <w:t>3</w:t>
+            </w:r>
+          </w:p>
+        </w:tc>
+        <w:tc>
+          <w:tcPr>
+            <w:tcW w:type="dxa" w:w="5472"/>
             <w:shd w:val="clear" w:color="auto" w:fill="EFF6FF"/>
           </w:tcPr>
           <w:p>
@@ -6158,7 +6365,7 @@
         </w:tc>
         <w:tc>
           <w:tcPr>
-            <w:tcW w:type="dxa" w:w="3744"/>
+            <w:tcW w:type="dxa" w:w="1008"/>
             <w:shd w:val="clear" w:color="auto" w:fill="EFF6FF"/>
           </w:tcPr>
           <w:p>
@@ -6169,7 +6376,196 @@
                 <w:i w:val="0"/>
                 <w:sz w:val="20"/>
               </w:rPr>
-              <w:t>Verifies data loader parses dates correctly</w:t>
+              <w:t>✅ PASS</w:t>
+            </w:r>
+          </w:p>
+        </w:tc>
+      </w:tr>
+      <w:tr>
+        <w:tc>
+          <w:tcPr>
+            <w:tcW w:type="dxa" w:w="432"/>
+          </w:tcPr>
+          <w:p>
+            <w:r>
+              <w:rPr>
+                <w:rFonts w:ascii="Calibri" w:hAnsi="Calibri"/>
+                <w:b w:val="0"/>
+                <w:i w:val="0"/>
+                <w:sz w:val="20"/>
+              </w:rPr>
+              <w:t>4</w:t>
+            </w:r>
+          </w:p>
+        </w:tc>
+        <w:tc>
+          <w:tcPr>
+            <w:tcW w:type="dxa" w:w="5472"/>
+          </w:tcPr>
+          <w:p>
+            <w:r>
+              <w:rPr>
+                <w:rFonts w:ascii="Calibri" w:hAnsi="Calibri"/>
+                <w:b w:val="0"/>
+                <w:i w:val="0"/>
+                <w:sz w:val="20"/>
+              </w:rPr>
+              <w:t>test_inventory_recommendation_invariants</w:t>
+            </w:r>
+          </w:p>
+        </w:tc>
+        <w:tc>
+          <w:tcPr>
+            <w:tcW w:type="dxa" w:w="1008"/>
+          </w:tcPr>
+          <w:p>
+            <w:r>
+              <w:rPr>
+                <w:rFonts w:ascii="Calibri" w:hAnsi="Calibri"/>
+                <w:b w:val="0"/>
+                <w:i w:val="0"/>
+                <w:sz w:val="20"/>
+              </w:rPr>
+              <w:t>✅ PASS</w:t>
+            </w:r>
+          </w:p>
+        </w:tc>
+      </w:tr>
+      <w:tr>
+        <w:tc>
+          <w:tcPr>
+            <w:tcW w:type="dxa" w:w="432"/>
+            <w:shd w:val="clear" w:color="auto" w:fill="EFF6FF"/>
+          </w:tcPr>
+          <w:p>
+            <w:r>
+              <w:rPr>
+                <w:rFonts w:ascii="Calibri" w:hAnsi="Calibri"/>
+                <w:b w:val="0"/>
+                <w:i w:val="0"/>
+                <w:sz w:val="20"/>
+              </w:rPr>
+              <w:t>5</w:t>
+            </w:r>
+          </w:p>
+        </w:tc>
+        <w:tc>
+          <w:tcPr>
+            <w:tcW w:type="dxa" w:w="5472"/>
+            <w:shd w:val="clear" w:color="auto" w:fill="EFF6FF"/>
+          </w:tcPr>
+          <w:p>
+            <w:r>
+              <w:rPr>
+                <w:rFonts w:ascii="Calibri" w:hAnsi="Calibri"/>
+                <w:b w:val="0"/>
+                <w:i w:val="0"/>
+                <w:sz w:val="20"/>
+              </w:rPr>
+              <w:t>test_inventory_recommendation_empty_category_returns_none</w:t>
+            </w:r>
+          </w:p>
+        </w:tc>
+        <w:tc>
+          <w:tcPr>
+            <w:tcW w:type="dxa" w:w="1008"/>
+            <w:shd w:val="clear" w:color="auto" w:fill="EFF6FF"/>
+          </w:tcPr>
+          <w:p>
+            <w:r>
+              <w:rPr>
+                <w:rFonts w:ascii="Calibri" w:hAnsi="Calibri"/>
+                <w:b w:val="0"/>
+                <w:i w:val="0"/>
+                <w:sz w:val="20"/>
+              </w:rPr>
+              <w:t>✅ PASS</w:t>
+            </w:r>
+          </w:p>
+        </w:tc>
+      </w:tr>
+      <w:tr>
+        <w:tc>
+          <w:tcPr>
+            <w:tcW w:type="dxa" w:w="432"/>
+          </w:tcPr>
+          <w:p>
+            <w:r>
+              <w:rPr>
+                <w:rFonts w:ascii="Calibri" w:hAnsi="Calibri"/>
+                <w:b w:val="0"/>
+                <w:i w:val="0"/>
+                <w:sz w:val="20"/>
+              </w:rPr>
+              <w:t>6</w:t>
+            </w:r>
+          </w:p>
+        </w:tc>
+        <w:tc>
+          <w:tcPr>
+            <w:tcW w:type="dxa" w:w="5472"/>
+          </w:tcPr>
+          <w:p>
+            <w:r>
+              <w:rPr>
+                <w:rFonts w:ascii="Calibri" w:hAnsi="Calibri"/>
+                <w:b w:val="0"/>
+                <w:i w:val="0"/>
+                <w:sz w:val="20"/>
+              </w:rPr>
+              <w:t>test_inventory_recommendation_monotonic_with_lead_time_and_service_level</w:t>
+            </w:r>
+          </w:p>
+        </w:tc>
+        <w:tc>
+          <w:tcPr>
+            <w:tcW w:type="dxa" w:w="1008"/>
+          </w:tcPr>
+          <w:p>
+            <w:r>
+              <w:rPr>
+                <w:rFonts w:ascii="Calibri" w:hAnsi="Calibri"/>
+                <w:b w:val="0"/>
+                <w:i w:val="0"/>
+                <w:sz w:val="20"/>
+              </w:rPr>
+              <w:t>✅ PASS</w:t>
+            </w:r>
+          </w:p>
+        </w:tc>
+      </w:tr>
+      <w:tr>
+        <w:tc>
+          <w:tcPr>
+            <w:tcW w:type="dxa" w:w="432"/>
+            <w:shd w:val="clear" w:color="auto" w:fill="EFF6FF"/>
+          </w:tcPr>
+          <w:p>
+            <w:r>
+              <w:rPr>
+                <w:rFonts w:ascii="Calibri" w:hAnsi="Calibri"/>
+                <w:b w:val="0"/>
+                <w:i w:val="0"/>
+                <w:sz w:val="20"/>
+              </w:rPr>
+              <w:t>7</w:t>
+            </w:r>
+          </w:p>
+        </w:tc>
+        <w:tc>
+          <w:tcPr>
+            <w:tcW w:type="dxa" w:w="5472"/>
+            <w:shd w:val="clear" w:color="auto" w:fill="EFF6FF"/>
+          </w:tcPr>
+          <w:p>
+            <w:r>
+              <w:rPr>
+                <w:rFonts w:ascii="Calibri" w:hAnsi="Calibri"/>
+                <w:b w:val="0"/>
+                <w:i w:val="0"/>
+                <w:sz w:val="20"/>
+              </w:rPr>
+              <w:t>test_compute_eda_returns_visualization_series</w:t>
             </w:r>
           </w:p>
         </w:tc>
@@ -6192,6 +6588,161 @@
         </w:tc>
       </w:tr>
     </w:tbl>
+    <w:p/>
+    <w:p>
+      <w:pPr>
+        <w:pStyle w:val="Heading3"/>
+        <w:jc w:val="left"/>
+      </w:pPr>
+      <w:r>
+        <w:rPr>
+          <w:rFonts w:ascii="Calibri" w:hAnsi="Calibri"/>
+          <w:color w:val="1F2937"/>
+          <w:sz w:val="22"/>
+        </w:rPr>
+        <w:t>6.6.1 Test Descriptions and Rationale</w:t>
+      </w:r>
+    </w:p>
+    <w:p>
+      <w:r>
+        <w:rPr>
+          <w:rFonts w:ascii="Calibri" w:hAnsi="Calibri"/>
+          <w:b/>
+          <w:i w:val="0"/>
+          <w:sz w:val="22"/>
+        </w:rPr>
+        <w:t xml:space="preserve">Test 1 — test_compute_daily_metrics_uses_category: </w:t>
+      </w:r>
+      <w:r>
+        <w:rPr>
+          <w:rFonts w:ascii="Calibri" w:hAnsi="Calibri"/>
+          <w:b w:val="0"/>
+          <w:i w:val="0"/>
+          <w:sz w:val="22"/>
+        </w:rPr>
+        <w:t>Calls the compute_daily_metrics() function and verifies that the result contains a top_qty_products key with valid category names. This validates that the dashboard KPI engine correctly groups sales data by product category. If this test fails, the home page would show broken or empty charts.</w:t>
+      </w:r>
+    </w:p>
+    <w:p>
+      <w:r>
+        <w:rPr>
+          <w:rFonts w:ascii="Calibri" w:hAnsi="Calibri"/>
+          <w:b/>
+          <w:i w:val="0"/>
+          <w:sz w:val="22"/>
+        </w:rPr>
+        <w:t xml:space="preserve">Test 2 — test_build_dss_recommendations: </w:t>
+      </w:r>
+      <w:r>
+        <w:rPr>
+          <w:rFonts w:ascii="Calibri" w:hAnsi="Calibri"/>
+          <w:b w:val="0"/>
+          <w:i w:val="0"/>
+          <w:sz w:val="22"/>
+        </w:rPr>
+        <w:t>Feeds top categories and their quantities into build_dss_recommendations() and checks that recommendations are generated and that the recommended_reorder value is at least as large as the monthly_average. This validates the core DSS rule-based logic: the reorder recommendation must always include a buffer above average demand. If this test fails, the system would recommend understocking, defeating the purpose of the DSS.</w:t>
+      </w:r>
+    </w:p>
+    <w:p>
+      <w:r>
+        <w:rPr>
+          <w:rFonts w:ascii="Calibri" w:hAnsi="Calibri"/>
+          <w:b/>
+          <w:i w:val="0"/>
+          <w:sz w:val="22"/>
+        </w:rPr>
+        <w:t xml:space="preserve">Test 3 — test_load_data_has_order_date: </w:t>
+      </w:r>
+      <w:r>
+        <w:rPr>
+          <w:rFonts w:ascii="Calibri" w:hAnsi="Calibri"/>
+          <w:b w:val="0"/>
+          <w:i w:val="0"/>
+          <w:sz w:val="22"/>
+        </w:rPr>
+        <w:t>Creates a temporary CSV file, loads it with load_data(), and verifies the resulting DataFrame is non-empty and contains an order_date column. This validates the data loading pipeline, ensuring dates are parsed correctly. If this test fails, all time-based aggregation (monthly trends, resampling) and Prophet forecasting would break.</w:t>
+      </w:r>
+    </w:p>
+    <w:p>
+      <w:r>
+        <w:rPr>
+          <w:rFonts w:ascii="Calibri" w:hAnsi="Calibri"/>
+          <w:b/>
+          <w:i w:val="0"/>
+          <w:sz w:val="22"/>
+        </w:rPr>
+        <w:t xml:space="preserve">Test 4 — test_inventory_recommendation_invariants: </w:t>
+      </w:r>
+      <w:r>
+        <w:rPr>
+          <w:rFonts w:ascii="Calibri" w:hAnsi="Calibri"/>
+          <w:b w:val="0"/>
+          <w:i w:val="0"/>
+          <w:sz w:val="22"/>
+        </w:rPr>
+        <w:t>Generates an inventory recommendation for the electronics category and verifies three invariants: reorder_point ≥ 0, safety_stock ≥ 0, and target_stock == reorder_point + safety_stock. This validates the inventory formula correctness. Target stock must always equal ROP + SS by definition — a mismatch would indicate a calculation bug. Negative values would be physically nonsensical since you cannot stock a negative number of units.</w:t>
+      </w:r>
+    </w:p>
+    <w:p>
+      <w:r>
+        <w:rPr>
+          <w:rFonts w:ascii="Calibri" w:hAnsi="Calibri"/>
+          <w:b/>
+          <w:i w:val="0"/>
+          <w:sz w:val="22"/>
+        </w:rPr>
+        <w:t xml:space="preserve">Test 5 — test_inventory_recommendation_empty_category_returns_none: </w:t>
+      </w:r>
+      <w:r>
+        <w:rPr>
+          <w:rFonts w:ascii="Calibri" w:hAnsi="Calibri"/>
+          <w:b w:val="0"/>
+          <w:i w:val="0"/>
+          <w:sz w:val="22"/>
+        </w:rPr>
+        <w:t>Requests an inventory recommendation for a non-existent category and expects None in return. This tests edge case handling: if a user selects a category that has no data, the system should gracefully return nothing rather than crashing with a division-by-zero or index error.</w:t>
+      </w:r>
+    </w:p>
+    <w:p>
+      <w:r>
+        <w:rPr>
+          <w:rFonts w:ascii="Calibri" w:hAnsi="Calibri"/>
+          <w:b/>
+          <w:i w:val="0"/>
+          <w:sz w:val="22"/>
+        </w:rPr>
+        <w:t xml:space="preserve">Test 6 — test_inventory_recommendation_monotonic_with_lead_time_and_service_level: </w:t>
+      </w:r>
+      <w:r>
+        <w:rPr>
+          <w:rFonts w:ascii="Calibri" w:hAnsi="Calibri"/>
+          <w:b w:val="0"/>
+          <w:i w:val="0"/>
+          <w:sz w:val="22"/>
+        </w:rPr>
+        <w:t>Computes three inventory recommendations with different parameters: a base case (7-day lead time, 90% service level), a higher-lead-time case (21 days), and a higher-service-level case (95%). It then verifies that longer lead time produces a higher reorder point and target stock, and that higher service level produces higher safety stock. This validates business logic monotonicity — the inventory formulas must behave in the direction expected by operations management theory. If these relationships break, the DSS would give counter-intuitive advice to managers.</w:t>
+      </w:r>
+    </w:p>
+    <w:p>
+      <w:r>
+        <w:rPr>
+          <w:rFonts w:ascii="Calibri" w:hAnsi="Calibri"/>
+          <w:b/>
+          <w:i w:val="0"/>
+          <w:sz w:val="22"/>
+        </w:rPr>
+        <w:t xml:space="preserve">Test 7 — test_compute_eda_returns_visualization_series: </w:t>
+      </w:r>
+      <w:r>
+        <w:rPr>
+          <w:rFonts w:ascii="Calibri" w:hAnsi="Calibri"/>
+          <w:b w:val="0"/>
+          <w:i w:val="0"/>
+          <w:sz w:val="22"/>
+        </w:rPr>
+        <w:t>Runs the compute_eda() function on enriched sample data and checks that price band arrays have exactly 5 labels and 5 values, and that category mix arrays (labels, revenue, quantity) are consistent in length. This validates the EDA visualization data pipeline. If array lengths mismatch, the Chart.js charts on the EDA page would render incorrectly or throw JavaScript errors.</w:t>
+      </w:r>
+    </w:p>
     <w:p/>
     <w:p>
       <w:r>

</xml_diff>